<commit_message>
Atualiza fichamentos e adiciona novos arquivos
</commit_message>
<xml_diff>
--- a/Fichamentos/FAI_SI_PFC_FormuláriodeApresentaçãodaProposta.docx
+++ b/Fichamentos/FAI_SI_PFC_FormuláriodeApresentaçãodaProposta.docx
@@ -98,7 +98,15 @@
                 <w:sz w:val="24"/>
                 <w:szCs w:val="24"/>
               </w:rPr>
-              <w:t>Comunitário na Localização de Animais Perdidos e Promoção da Adoção Responsável</w:t>
+              <w:t>Comunitário na Localização de Animais Perdidos e Promoção da Adoção</w:t>
+            </w:r>
+            <w:r>
+              <w:rPr>
+                <w:rFonts w:ascii="Arial" w:hAnsi="Arial" w:cs="Arial"/>
+                <w:sz w:val="24"/>
+                <w:szCs w:val="24"/>
+              </w:rPr>
+              <w:t xml:space="preserve"> animal</w:t>
             </w:r>
             <w:r>
               <w:rPr>
@@ -107,6 +115,14 @@
                 <w:szCs w:val="24"/>
               </w:rPr>
               <w:t>, nomeado “Focinho Feliz”</w:t>
+            </w:r>
+            <w:r>
+              <w:rPr>
+                <w:rFonts w:ascii="Arial" w:hAnsi="Arial" w:cs="Arial"/>
+                <w:sz w:val="24"/>
+                <w:szCs w:val="24"/>
+              </w:rPr>
+              <w:t>.</w:t>
             </w:r>
           </w:p>
           <w:p>
@@ -510,18 +526,8 @@
                 <w:sz w:val="24"/>
                 <w:szCs w:val="24"/>
               </w:rPr>
-              <w:t xml:space="preserve">Desenvolvimento de Aplicações Mobile com </w:t>
-            </w:r>
-            <w:proofErr w:type="spellStart"/>
-            <w:r>
-              <w:rPr>
-                <w:rFonts w:ascii="Arial" w:hAnsi="Arial" w:cs="Arial"/>
-                <w:sz w:val="24"/>
-                <w:szCs w:val="24"/>
-              </w:rPr>
-              <w:t>Flutter</w:t>
-            </w:r>
-            <w:proofErr w:type="spellEnd"/>
+              <w:t>Desenvolvimento de Aplicações Mobile com Flutter</w:t>
+            </w:r>
             <w:r>
               <w:rPr>
                 <w:rFonts w:ascii="Arial" w:hAnsi="Arial" w:cs="Arial"/>
@@ -842,6 +848,7 @@
               </w:rPr>
               <w:t xml:space="preserve"> </w:t>
             </w:r>
+            <w:bookmarkStart w:id="2" w:name="_Hlk222295704"/>
             <w:r>
               <w:rPr>
                 <w:rFonts w:ascii="Arial" w:hAnsi="Arial" w:cs="Arial"/>
@@ -858,6 +865,7 @@
               </w:rPr>
               <w:t>.</w:t>
             </w:r>
+            <w:bookmarkEnd w:id="2"/>
           </w:p>
           <w:p>
             <w:pPr>
@@ -890,13 +898,34 @@
             <w:r>
               <w:rPr>
                 <w:rFonts w:ascii="Arial" w:hAnsi="Arial" w:cs="Arial"/>
-                <w:b/>
-                <w:bCs/>
-                <w:color w:val="EE0000"/>
-                <w:sz w:val="24"/>
-                <w:szCs w:val="24"/>
-              </w:rPr>
-              <w:t>FALTAR FAZER</w:t>
+                <w:sz w:val="24"/>
+                <w:szCs w:val="24"/>
+              </w:rPr>
+              <w:t xml:space="preserve">(Fichamento </w:t>
+            </w:r>
+            <w:r>
+              <w:rPr>
+                <w:rFonts w:ascii="Arial" w:hAnsi="Arial" w:cs="Arial"/>
+                <w:sz w:val="24"/>
+                <w:szCs w:val="24"/>
+              </w:rPr>
+              <w:t>V</w:t>
+            </w:r>
+            <w:r>
+              <w:rPr>
+                <w:rFonts w:ascii="Arial" w:hAnsi="Arial" w:cs="Arial"/>
+                <w:sz w:val="24"/>
+                <w:szCs w:val="24"/>
+              </w:rPr>
+              <w:t>I</w:t>
+            </w:r>
+            <w:r>
+              <w:rPr>
+                <w:rFonts w:ascii="Arial" w:hAnsi="Arial" w:cs="Arial"/>
+                <w:sz w:val="24"/>
+                <w:szCs w:val="24"/>
+              </w:rPr>
+              <w:t>).</w:t>
             </w:r>
           </w:p>
         </w:tc>
@@ -1006,9 +1035,9 @@
         <w:tblLook w:val="0000" w:firstRow="0" w:lastRow="0" w:firstColumn="0" w:lastColumn="0" w:noHBand="0" w:noVBand="0"/>
       </w:tblPr>
       <w:tblGrid>
-        <w:gridCol w:w="1554"/>
-        <w:gridCol w:w="3880"/>
-        <w:gridCol w:w="3961"/>
+        <w:gridCol w:w="1560"/>
+        <w:gridCol w:w="4075"/>
+        <w:gridCol w:w="3760"/>
       </w:tblGrid>
       <w:tr>
         <w:tc>
@@ -1149,7 +1178,6 @@
                 <w:szCs w:val="24"/>
               </w:rPr>
             </w:pPr>
-            <w:proofErr w:type="spellStart"/>
             <w:r>
               <w:rPr>
                 <w:rFonts w:ascii="Arial" w:hAnsi="Arial" w:cs="Arial"/>
@@ -1157,9 +1185,26 @@
                 <w:sz w:val="24"/>
                 <w:szCs w:val="24"/>
               </w:rPr>
-              <w:t>AndreyFaria</w:t>
-            </w:r>
-            <w:proofErr w:type="spellEnd"/>
+              <w:t>Andrey</w:t>
+            </w:r>
+            <w:r>
+              <w:rPr>
+                <w:rFonts w:ascii="Arial" w:hAnsi="Arial" w:cs="Arial"/>
+                <w:bCs/>
+                <w:sz w:val="24"/>
+                <w:szCs w:val="24"/>
+              </w:rPr>
+              <w:t xml:space="preserve"> </w:t>
+            </w:r>
+            <w:r>
+              <w:rPr>
+                <w:rFonts w:ascii="Arial" w:hAnsi="Arial" w:cs="Arial"/>
+                <w:bCs/>
+                <w:sz w:val="24"/>
+                <w:szCs w:val="24"/>
+              </w:rPr>
+              <w:t>Faria</w:t>
+            </w:r>
           </w:p>
         </w:tc>
       </w:tr>
@@ -1218,7 +1263,6 @@
                 <w:szCs w:val="24"/>
               </w:rPr>
             </w:pPr>
-            <w:proofErr w:type="spellStart"/>
             <w:r>
               <w:rPr>
                 <w:rFonts w:ascii="Arial" w:hAnsi="Arial" w:cs="Arial"/>
@@ -1226,37 +1270,7 @@
                 <w:sz w:val="24"/>
                 <w:szCs w:val="24"/>
               </w:rPr>
-              <w:t>Thamíris</w:t>
-            </w:r>
-            <w:proofErr w:type="spellEnd"/>
-            <w:r>
-              <w:rPr>
-                <w:rFonts w:ascii="Arial" w:hAnsi="Arial" w:cs="Arial"/>
-                <w:bCs/>
-                <w:sz w:val="24"/>
-                <w:szCs w:val="24"/>
-              </w:rPr>
-              <w:t xml:space="preserve"> </w:t>
-            </w:r>
-            <w:proofErr w:type="spellStart"/>
-            <w:r>
-              <w:rPr>
-                <w:rFonts w:ascii="Arial" w:hAnsi="Arial" w:cs="Arial"/>
-                <w:bCs/>
-                <w:sz w:val="24"/>
-                <w:szCs w:val="24"/>
-              </w:rPr>
-              <w:t>Gracielle</w:t>
-            </w:r>
-            <w:proofErr w:type="spellEnd"/>
-            <w:r>
-              <w:rPr>
-                <w:rFonts w:ascii="Arial" w:hAnsi="Arial" w:cs="Arial"/>
-                <w:bCs/>
-                <w:sz w:val="24"/>
-                <w:szCs w:val="24"/>
-              </w:rPr>
-              <w:t xml:space="preserve"> Moreira Pereira</w:t>
+              <w:t>Thamíris Gracielle Moreira Pereira</w:t>
             </w:r>
           </w:p>
         </w:tc>
@@ -1277,7 +1291,6 @@
                 <w:szCs w:val="24"/>
               </w:rPr>
             </w:pPr>
-            <w:proofErr w:type="spellStart"/>
             <w:r>
               <w:rPr>
                 <w:rFonts w:ascii="Arial" w:hAnsi="Arial" w:cs="Arial"/>
@@ -1285,9 +1298,26 @@
                 <w:sz w:val="24"/>
                 <w:szCs w:val="24"/>
               </w:rPr>
-              <w:t>ThamírisGracielle</w:t>
-            </w:r>
-            <w:proofErr w:type="spellEnd"/>
+              <w:t>Thamíris</w:t>
+            </w:r>
+            <w:r>
+              <w:rPr>
+                <w:rFonts w:ascii="Arial" w:hAnsi="Arial" w:cs="Arial"/>
+                <w:bCs/>
+                <w:sz w:val="24"/>
+                <w:szCs w:val="24"/>
+              </w:rPr>
+              <w:t xml:space="preserve"> </w:t>
+            </w:r>
+            <w:r>
+              <w:rPr>
+                <w:rFonts w:ascii="Arial" w:hAnsi="Arial" w:cs="Arial"/>
+                <w:bCs/>
+                <w:sz w:val="24"/>
+                <w:szCs w:val="24"/>
+              </w:rPr>
+              <w:t>Gracielle</w:t>
+            </w:r>
           </w:p>
         </w:tc>
       </w:tr>
@@ -1441,16 +1471,6 @@
           </w:tcPr>
           <w:p>
             <w:pPr>
-              <w:rPr>
-                <w:rFonts w:ascii="Arial" w:hAnsi="Arial" w:cs="Arial"/>
-                <w:bCs/>
-                <w:sz w:val="24"/>
-                <w:szCs w:val="24"/>
-              </w:rPr>
-            </w:pPr>
-          </w:p>
-          <w:p>
-            <w:pPr>
               <w:pStyle w:val="NormalWeb"/>
             </w:pPr>
             <w:r>
@@ -1480,11 +1500,13 @@
             <w:r>
               <w:t xml:space="preserve">A aplicação permitirá a busca por ocorrências com base em localização e raio de proximidade, exibindo os eventos em um mapa interativo. O sistema será estruturado com uma arquitetura baseada em serviços, contemplando comunicação com API </w:t>
             </w:r>
-            <w:proofErr w:type="spellStart"/>
-            <w:r>
+            <w:r>
+              <w:rPr>
+                <w:i/>
+                <w:iCs/>
+              </w:rPr>
               <w:t>backend</w:t>
             </w:r>
-            <w:proofErr w:type="spellEnd"/>
             <w:r>
               <w:t xml:space="preserve"> responsável pelas regras de negócio, armazenamento de dados geográficos e processamento de informações de localização.</w:t>
             </w:r>
@@ -1543,16 +1565,8 @@
               <w:rPr>
                 <w:rStyle w:val="Forte"/>
               </w:rPr>
-              <w:t xml:space="preserve">API </w:t>
-            </w:r>
-            <w:proofErr w:type="spellStart"/>
-            <w:r>
-              <w:rPr>
-                <w:rStyle w:val="Forte"/>
-              </w:rPr>
-              <w:t>Backend</w:t>
-            </w:r>
-            <w:proofErr w:type="spellEnd"/>
+              <w:t>API Backend</w:t>
+            </w:r>
             <w:r>
               <w:t xml:space="preserve"> – responsável pela implementação das regras de negócio, gerenciamento de dados geográficos, autenticação de usuários e processamento de eventos registrados no sistema.</w:t>
             </w:r>
@@ -1675,6 +1689,7 @@
           <w:sz w:val="24"/>
           <w:szCs w:val="24"/>
         </w:rPr>
+        <w:lastRenderedPageBreak/>
         <w:t xml:space="preserve">5 </w:t>
       </w:r>
       <w:r>
@@ -1747,13 +1762,23 @@
                 <w:szCs w:val="24"/>
               </w:rPr>
             </w:pPr>
-            <w:r>
+          </w:p>
+          <w:p>
+            <w:pPr>
               <w:rPr>
                 <w:rFonts w:ascii="Arial" w:hAnsi="Arial" w:cs="Arial"/>
                 <w:b/>
                 <w:sz w:val="24"/>
                 <w:szCs w:val="24"/>
               </w:rPr>
+            </w:pPr>
+            <w:r>
+              <w:rPr>
+                <w:rFonts w:ascii="Arial" w:hAnsi="Arial" w:cs="Arial"/>
+                <w:b/>
+                <w:sz w:val="24"/>
+                <w:szCs w:val="24"/>
+              </w:rPr>
               <w:t>Metodologia:</w:t>
             </w:r>
           </w:p>
@@ -1802,6 +1827,16 @@
               </w:rPr>
               <w:t xml:space="preserve"> com entregas parciais ao longo do ano letivo, permitindo evolução contínua do sistema e validação progressiva das funcionalidades implementadas.</w:t>
             </w:r>
+          </w:p>
+          <w:p>
+            <w:pPr>
+              <w:rPr>
+                <w:rFonts w:ascii="Arial" w:hAnsi="Arial" w:cs="Arial"/>
+                <w:bCs/>
+                <w:sz w:val="24"/>
+                <w:szCs w:val="24"/>
+              </w:rPr>
+            </w:pPr>
           </w:p>
           <w:p>
             <w:pPr>
@@ -1865,98 +1900,6 @@
           </w:p>
           <w:p>
             <w:pPr>
-              <w:numPr>
-                <w:ilvl w:val="0"/>
-                <w:numId w:val="31"/>
-              </w:numPr>
-              <w:rPr>
-                <w:rFonts w:ascii="Arial" w:hAnsi="Arial" w:cs="Arial"/>
-                <w:bCs/>
-                <w:sz w:val="24"/>
-                <w:szCs w:val="24"/>
-              </w:rPr>
-            </w:pPr>
-            <w:r>
-              <w:rPr>
-                <w:rFonts w:ascii="Arial" w:hAnsi="Arial" w:cs="Arial"/>
-                <w:bCs/>
-                <w:sz w:val="24"/>
-                <w:szCs w:val="24"/>
-              </w:rPr>
-              <w:t>Definição do escopo do sistema;</w:t>
-            </w:r>
-          </w:p>
-          <w:p>
-            <w:pPr>
-              <w:numPr>
-                <w:ilvl w:val="0"/>
-                <w:numId w:val="31"/>
-              </w:numPr>
-              <w:rPr>
-                <w:rFonts w:ascii="Arial" w:hAnsi="Arial" w:cs="Arial"/>
-                <w:bCs/>
-                <w:sz w:val="24"/>
-                <w:szCs w:val="24"/>
-              </w:rPr>
-            </w:pPr>
-            <w:r>
-              <w:rPr>
-                <w:rFonts w:ascii="Arial" w:hAnsi="Arial" w:cs="Arial"/>
-                <w:bCs/>
-                <w:sz w:val="24"/>
-                <w:szCs w:val="24"/>
-              </w:rPr>
-              <w:t>Levantamento de requisitos funcionais e não funcionais;</w:t>
-            </w:r>
-          </w:p>
-          <w:p>
-            <w:pPr>
-              <w:numPr>
-                <w:ilvl w:val="0"/>
-                <w:numId w:val="31"/>
-              </w:numPr>
-              <w:rPr>
-                <w:rFonts w:ascii="Arial" w:hAnsi="Arial" w:cs="Arial"/>
-                <w:bCs/>
-                <w:sz w:val="24"/>
-                <w:szCs w:val="24"/>
-              </w:rPr>
-            </w:pPr>
-            <w:r>
-              <w:rPr>
-                <w:rFonts w:ascii="Arial" w:hAnsi="Arial" w:cs="Arial"/>
-                <w:bCs/>
-                <w:sz w:val="24"/>
-                <w:szCs w:val="24"/>
-              </w:rPr>
-              <w:t>Entrevistas e aplicação de questionários com potenciais usuários (tutores de animais);</w:t>
-            </w:r>
-          </w:p>
-          <w:p>
-            <w:pPr>
-              <w:numPr>
-                <w:ilvl w:val="0"/>
-                <w:numId w:val="31"/>
-              </w:numPr>
-              <w:rPr>
-                <w:rFonts w:ascii="Arial" w:hAnsi="Arial" w:cs="Arial"/>
-                <w:bCs/>
-                <w:sz w:val="24"/>
-                <w:szCs w:val="24"/>
-              </w:rPr>
-            </w:pPr>
-            <w:r>
-              <w:rPr>
-                <w:rFonts w:ascii="Arial" w:hAnsi="Arial" w:cs="Arial"/>
-                <w:bCs/>
-                <w:sz w:val="24"/>
-                <w:szCs w:val="24"/>
-              </w:rPr>
-              <w:t>Modelagem inicial do sistema e prototipação das interfaces.</w:t>
-            </w:r>
-          </w:p>
-          <w:p>
-            <w:pPr>
               <w:ind w:left="720"/>
               <w:rPr>
                 <w:rFonts w:ascii="Arial" w:hAnsi="Arial" w:cs="Arial"/>
@@ -1984,10 +1927,32 @@
                 <w:sz w:val="24"/>
                 <w:szCs w:val="24"/>
               </w:rPr>
-              <w:t xml:space="preserve">2ª Etapa – Desenvolvimento do </w:t>
-            </w:r>
-            <w:proofErr w:type="spellStart"/>
-            <w:r>
+              <w:t>2ª Etapa – Desenvolvimento do Backend</w:t>
+            </w:r>
+          </w:p>
+          <w:p>
+            <w:pPr>
+              <w:rPr>
+                <w:rFonts w:ascii="Arial" w:hAnsi="Arial" w:cs="Arial"/>
+                <w:bCs/>
+                <w:sz w:val="24"/>
+                <w:szCs w:val="24"/>
+              </w:rPr>
+            </w:pPr>
+          </w:p>
+          <w:p>
+            <w:pPr>
+              <w:ind w:left="720"/>
+              <w:rPr>
+                <w:rFonts w:ascii="Arial" w:hAnsi="Arial" w:cs="Arial"/>
+                <w:bCs/>
+                <w:sz w:val="24"/>
+                <w:szCs w:val="24"/>
+              </w:rPr>
+            </w:pPr>
+          </w:p>
+          <w:p>
+            <w:pPr>
               <w:rPr>
                 <w:rFonts w:ascii="Arial" w:hAnsi="Arial" w:cs="Arial"/>
                 <w:b/>
@@ -1995,188 +1960,8 @@
                 <w:sz w:val="24"/>
                 <w:szCs w:val="24"/>
               </w:rPr>
-              <w:t>Backend</w:t>
-            </w:r>
-            <w:proofErr w:type="spellEnd"/>
-          </w:p>
-          <w:p>
-            <w:pPr>
-              <w:rPr>
-                <w:rFonts w:ascii="Arial" w:hAnsi="Arial" w:cs="Arial"/>
-                <w:bCs/>
-                <w:sz w:val="24"/>
-                <w:szCs w:val="24"/>
-              </w:rPr>
-            </w:pPr>
-          </w:p>
-          <w:p>
-            <w:pPr>
-              <w:numPr>
-                <w:ilvl w:val="0"/>
-                <w:numId w:val="32"/>
-              </w:numPr>
-              <w:rPr>
-                <w:rFonts w:ascii="Arial" w:hAnsi="Arial" w:cs="Arial"/>
-                <w:bCs/>
-                <w:sz w:val="24"/>
-                <w:szCs w:val="24"/>
-              </w:rPr>
-            </w:pPr>
-            <w:r>
-              <w:rPr>
-                <w:rFonts w:ascii="Arial" w:hAnsi="Arial" w:cs="Arial"/>
-                <w:bCs/>
-                <w:sz w:val="24"/>
-                <w:szCs w:val="24"/>
-              </w:rPr>
-              <w:t>Implementação da API utilizando Java 21 e Spring Boot;</w:t>
-            </w:r>
-          </w:p>
-          <w:p>
-            <w:pPr>
-              <w:numPr>
-                <w:ilvl w:val="0"/>
-                <w:numId w:val="32"/>
-              </w:numPr>
-              <w:rPr>
-                <w:rFonts w:ascii="Arial" w:hAnsi="Arial" w:cs="Arial"/>
-                <w:bCs/>
-                <w:sz w:val="24"/>
-                <w:szCs w:val="24"/>
-              </w:rPr>
-            </w:pPr>
-            <w:r>
-              <w:rPr>
-                <w:rFonts w:ascii="Arial" w:hAnsi="Arial" w:cs="Arial"/>
-                <w:bCs/>
-                <w:sz w:val="24"/>
-                <w:szCs w:val="24"/>
-              </w:rPr>
-              <w:t xml:space="preserve">Modelagem e implementação do banco de dados geográfico (PostgreSQL com </w:t>
-            </w:r>
-            <w:proofErr w:type="spellStart"/>
-            <w:r>
-              <w:rPr>
-                <w:rFonts w:ascii="Arial" w:hAnsi="Arial" w:cs="Arial"/>
-                <w:bCs/>
-                <w:sz w:val="24"/>
-                <w:szCs w:val="24"/>
-              </w:rPr>
-              <w:t>PostGIS</w:t>
-            </w:r>
-            <w:proofErr w:type="spellEnd"/>
-            <w:r>
-              <w:rPr>
-                <w:rFonts w:ascii="Arial" w:hAnsi="Arial" w:cs="Arial"/>
-                <w:bCs/>
-                <w:sz w:val="24"/>
-                <w:szCs w:val="24"/>
-              </w:rPr>
-              <w:t>);</w:t>
-            </w:r>
-          </w:p>
-          <w:p>
-            <w:pPr>
-              <w:numPr>
-                <w:ilvl w:val="0"/>
-                <w:numId w:val="32"/>
-              </w:numPr>
-              <w:rPr>
-                <w:rFonts w:ascii="Arial" w:hAnsi="Arial" w:cs="Arial"/>
-                <w:bCs/>
-                <w:sz w:val="24"/>
-                <w:szCs w:val="24"/>
-              </w:rPr>
-            </w:pPr>
-            <w:r>
-              <w:rPr>
-                <w:rFonts w:ascii="Arial" w:hAnsi="Arial" w:cs="Arial"/>
-                <w:bCs/>
-                <w:sz w:val="24"/>
-                <w:szCs w:val="24"/>
-              </w:rPr>
-              <w:t>Implementação das regras de negócio;</w:t>
-            </w:r>
-          </w:p>
-          <w:p>
-            <w:pPr>
-              <w:numPr>
-                <w:ilvl w:val="0"/>
-                <w:numId w:val="32"/>
-              </w:numPr>
-              <w:rPr>
-                <w:rFonts w:ascii="Arial" w:hAnsi="Arial" w:cs="Arial"/>
-                <w:bCs/>
-                <w:sz w:val="24"/>
-                <w:szCs w:val="24"/>
-              </w:rPr>
-            </w:pPr>
-            <w:r>
-              <w:rPr>
-                <w:rFonts w:ascii="Arial" w:hAnsi="Arial" w:cs="Arial"/>
-                <w:bCs/>
-                <w:sz w:val="24"/>
-                <w:szCs w:val="24"/>
-              </w:rPr>
-              <w:t xml:space="preserve">Estruturação da comunicação assíncrona por meio de mensageria (ex.: </w:t>
-            </w:r>
-            <w:proofErr w:type="spellStart"/>
-            <w:r>
-              <w:rPr>
-                <w:rFonts w:ascii="Arial" w:hAnsi="Arial" w:cs="Arial"/>
-                <w:bCs/>
-                <w:sz w:val="24"/>
-                <w:szCs w:val="24"/>
-              </w:rPr>
-              <w:t>RabbitMQ</w:t>
-            </w:r>
-            <w:proofErr w:type="spellEnd"/>
-            <w:r>
-              <w:rPr>
-                <w:rFonts w:ascii="Arial" w:hAnsi="Arial" w:cs="Arial"/>
-                <w:bCs/>
-                <w:sz w:val="24"/>
-                <w:szCs w:val="24"/>
-              </w:rPr>
-              <w:t>);</w:t>
-            </w:r>
-          </w:p>
-          <w:p>
-            <w:pPr>
-              <w:numPr>
-                <w:ilvl w:val="0"/>
-                <w:numId w:val="32"/>
-              </w:numPr>
-              <w:rPr>
-                <w:rFonts w:ascii="Arial" w:hAnsi="Arial" w:cs="Arial"/>
-                <w:bCs/>
-                <w:sz w:val="24"/>
-                <w:szCs w:val="24"/>
-              </w:rPr>
-            </w:pPr>
-            <w:r>
-              <w:rPr>
-                <w:rFonts w:ascii="Arial" w:hAnsi="Arial" w:cs="Arial"/>
-                <w:bCs/>
-                <w:sz w:val="24"/>
-                <w:szCs w:val="24"/>
-              </w:rPr>
-              <w:t>Testes unitários e de integração.</w:t>
-            </w:r>
-          </w:p>
-          <w:p>
-            <w:pPr>
-              <w:ind w:left="720"/>
-              <w:rPr>
-                <w:rFonts w:ascii="Arial" w:hAnsi="Arial" w:cs="Arial"/>
-                <w:bCs/>
-                <w:sz w:val="24"/>
-                <w:szCs w:val="24"/>
-              </w:rPr>
-            </w:pPr>
-          </w:p>
-          <w:p>
-            <w:pPr>
+            </w:pPr>
+            <w:r>
               <w:rPr>
                 <w:rFonts w:ascii="Arial" w:hAnsi="Arial" w:cs="Arial"/>
                 <w:b/>
@@ -2184,8 +1969,32 @@
                 <w:sz w:val="24"/>
                 <w:szCs w:val="24"/>
               </w:rPr>
-            </w:pPr>
-            <w:r>
+              <w:t>3ª Etapa – Desenvolvimento da Aplicação Mobile</w:t>
+            </w:r>
+          </w:p>
+          <w:p>
+            <w:pPr>
+              <w:rPr>
+                <w:rFonts w:ascii="Arial" w:hAnsi="Arial" w:cs="Arial"/>
+                <w:bCs/>
+                <w:sz w:val="24"/>
+                <w:szCs w:val="24"/>
+              </w:rPr>
+            </w:pPr>
+          </w:p>
+          <w:p>
+            <w:pPr>
+              <w:ind w:left="720"/>
+              <w:rPr>
+                <w:rFonts w:ascii="Arial" w:hAnsi="Arial" w:cs="Arial"/>
+                <w:bCs/>
+                <w:sz w:val="24"/>
+                <w:szCs w:val="24"/>
+              </w:rPr>
+            </w:pPr>
+          </w:p>
+          <w:p>
+            <w:pPr>
               <w:rPr>
                 <w:rFonts w:ascii="Arial" w:hAnsi="Arial" w:cs="Arial"/>
                 <w:b/>
@@ -2193,164 +2002,8 @@
                 <w:sz w:val="24"/>
                 <w:szCs w:val="24"/>
               </w:rPr>
-              <w:t>3ª Etapa – Desenvolvimento da Aplicação Mobile</w:t>
-            </w:r>
-          </w:p>
-          <w:p>
-            <w:pPr>
-              <w:rPr>
-                <w:rFonts w:ascii="Arial" w:hAnsi="Arial" w:cs="Arial"/>
-                <w:bCs/>
-                <w:sz w:val="24"/>
-                <w:szCs w:val="24"/>
-              </w:rPr>
-            </w:pPr>
-          </w:p>
-          <w:p>
-            <w:pPr>
-              <w:numPr>
-                <w:ilvl w:val="0"/>
-                <w:numId w:val="33"/>
-              </w:numPr>
-              <w:rPr>
-                <w:rFonts w:ascii="Arial" w:hAnsi="Arial" w:cs="Arial"/>
-                <w:bCs/>
-                <w:sz w:val="24"/>
-                <w:szCs w:val="24"/>
-              </w:rPr>
-            </w:pPr>
-            <w:r>
-              <w:rPr>
-                <w:rFonts w:ascii="Arial" w:hAnsi="Arial" w:cs="Arial"/>
-                <w:bCs/>
-                <w:sz w:val="24"/>
-                <w:szCs w:val="24"/>
-              </w:rPr>
-              <w:t xml:space="preserve">Implementação da aplicação em </w:t>
-            </w:r>
-            <w:proofErr w:type="spellStart"/>
-            <w:r>
-              <w:rPr>
-                <w:rFonts w:ascii="Arial" w:hAnsi="Arial" w:cs="Arial"/>
-                <w:bCs/>
-                <w:sz w:val="24"/>
-                <w:szCs w:val="24"/>
-              </w:rPr>
-              <w:t>Flutter</w:t>
-            </w:r>
-            <w:proofErr w:type="spellEnd"/>
-            <w:r>
-              <w:rPr>
-                <w:rFonts w:ascii="Arial" w:hAnsi="Arial" w:cs="Arial"/>
-                <w:bCs/>
-                <w:sz w:val="24"/>
-                <w:szCs w:val="24"/>
-              </w:rPr>
-              <w:t>;</w:t>
-            </w:r>
-          </w:p>
-          <w:p>
-            <w:pPr>
-              <w:numPr>
-                <w:ilvl w:val="0"/>
-                <w:numId w:val="33"/>
-              </w:numPr>
-              <w:rPr>
-                <w:rFonts w:ascii="Arial" w:hAnsi="Arial" w:cs="Arial"/>
-                <w:bCs/>
-                <w:sz w:val="24"/>
-                <w:szCs w:val="24"/>
-              </w:rPr>
-            </w:pPr>
-            <w:r>
-              <w:rPr>
-                <w:rFonts w:ascii="Arial" w:hAnsi="Arial" w:cs="Arial"/>
-                <w:bCs/>
-                <w:sz w:val="24"/>
-                <w:szCs w:val="24"/>
-              </w:rPr>
-              <w:t xml:space="preserve">Integração com API </w:t>
-            </w:r>
-            <w:proofErr w:type="spellStart"/>
-            <w:r>
-              <w:rPr>
-                <w:rFonts w:ascii="Arial" w:hAnsi="Arial" w:cs="Arial"/>
-                <w:bCs/>
-                <w:sz w:val="24"/>
-                <w:szCs w:val="24"/>
-              </w:rPr>
-              <w:t>backend</w:t>
-            </w:r>
-            <w:proofErr w:type="spellEnd"/>
-            <w:r>
-              <w:rPr>
-                <w:rFonts w:ascii="Arial" w:hAnsi="Arial" w:cs="Arial"/>
-                <w:bCs/>
-                <w:sz w:val="24"/>
-                <w:szCs w:val="24"/>
-              </w:rPr>
-              <w:t>;</w:t>
-            </w:r>
-          </w:p>
-          <w:p>
-            <w:pPr>
-              <w:numPr>
-                <w:ilvl w:val="0"/>
-                <w:numId w:val="33"/>
-              </w:numPr>
-              <w:rPr>
-                <w:rFonts w:ascii="Arial" w:hAnsi="Arial" w:cs="Arial"/>
-                <w:bCs/>
-                <w:sz w:val="24"/>
-                <w:szCs w:val="24"/>
-              </w:rPr>
-            </w:pPr>
-            <w:r>
-              <w:rPr>
-                <w:rFonts w:ascii="Arial" w:hAnsi="Arial" w:cs="Arial"/>
-                <w:bCs/>
-                <w:sz w:val="24"/>
-                <w:szCs w:val="24"/>
-              </w:rPr>
-              <w:t>Implementação de visualização georreferenciada em mapa;</w:t>
-            </w:r>
-          </w:p>
-          <w:p>
-            <w:pPr>
-              <w:numPr>
-                <w:ilvl w:val="0"/>
-                <w:numId w:val="33"/>
-              </w:numPr>
-              <w:rPr>
-                <w:rFonts w:ascii="Arial" w:hAnsi="Arial" w:cs="Arial"/>
-                <w:bCs/>
-                <w:sz w:val="24"/>
-                <w:szCs w:val="24"/>
-              </w:rPr>
-            </w:pPr>
-            <w:r>
-              <w:rPr>
-                <w:rFonts w:ascii="Arial" w:hAnsi="Arial" w:cs="Arial"/>
-                <w:bCs/>
-                <w:sz w:val="24"/>
-                <w:szCs w:val="24"/>
-              </w:rPr>
-              <w:t>Implementação de filtros por raio de busca.</w:t>
-            </w:r>
-          </w:p>
-          <w:p>
-            <w:pPr>
-              <w:ind w:left="720"/>
-              <w:rPr>
-                <w:rFonts w:ascii="Arial" w:hAnsi="Arial" w:cs="Arial"/>
-                <w:bCs/>
-                <w:sz w:val="24"/>
-                <w:szCs w:val="24"/>
-              </w:rPr>
-            </w:pPr>
-          </w:p>
-          <w:p>
-            <w:pPr>
+            </w:pPr>
+            <w:r>
               <w:rPr>
                 <w:rFonts w:ascii="Arial" w:hAnsi="Arial" w:cs="Arial"/>
                 <w:b/>
@@ -2358,17 +2011,108 @@
                 <w:sz w:val="24"/>
                 <w:szCs w:val="24"/>
               </w:rPr>
-            </w:pPr>
-            <w:r>
+              <w:t>4ª Etapa – Testes, Validação e Implantação</w:t>
+            </w:r>
+          </w:p>
+          <w:p>
+            <w:pPr>
+              <w:rPr>
+                <w:rFonts w:ascii="Arial" w:hAnsi="Arial" w:cs="Arial"/>
+                <w:bCs/>
+                <w:sz w:val="24"/>
+                <w:szCs w:val="24"/>
+              </w:rPr>
+            </w:pPr>
+            <w:r>
+              <w:rPr>
+                <w:rFonts w:ascii="Arial" w:hAnsi="Arial" w:cs="Arial"/>
+                <w:bCs/>
+                <w:sz w:val="24"/>
+                <w:szCs w:val="24"/>
+              </w:rPr>
+              <w:t>.</w:t>
+            </w:r>
+          </w:p>
+          <w:p>
+            <w:pPr>
+              <w:pStyle w:val="NormalWeb"/>
+              <w:rPr>
+                <w:rFonts w:ascii="Arial" w:hAnsi="Arial" w:cs="Arial"/>
+              </w:rPr>
+            </w:pPr>
+          </w:p>
+          <w:p>
+            <w:pPr>
               <w:rPr>
                 <w:rFonts w:ascii="Arial" w:hAnsi="Arial" w:cs="Arial"/>
                 <w:b/>
+                <w:sz w:val="24"/>
+                <w:szCs w:val="24"/>
+              </w:rPr>
+            </w:pPr>
+            <w:r>
+              <w:rPr>
+                <w:rFonts w:ascii="Arial" w:hAnsi="Arial" w:cs="Arial"/>
+                <w:b/>
+                <w:sz w:val="24"/>
+                <w:szCs w:val="24"/>
+              </w:rPr>
+              <w:t>Responsabilidades</w:t>
+            </w:r>
+            <w:r>
+              <w:rPr>
+                <w:rFonts w:ascii="Arial" w:hAnsi="Arial" w:cs="Arial"/>
+                <w:b/>
+                <w:sz w:val="24"/>
+                <w:szCs w:val="24"/>
+              </w:rPr>
+              <w:t>:</w:t>
+            </w:r>
+          </w:p>
+          <w:p>
+            <w:pPr>
+              <w:rPr>
+                <w:rFonts w:ascii="Arial" w:hAnsi="Arial" w:cs="Arial"/>
+                <w:b/>
+                <w:sz w:val="24"/>
+                <w:szCs w:val="24"/>
+              </w:rPr>
+            </w:pPr>
+          </w:p>
+          <w:p>
+            <w:pPr>
+              <w:rPr>
+                <w:rFonts w:ascii="Arial" w:hAnsi="Arial" w:cs="Arial"/>
+                <w:sz w:val="24"/>
+                <w:szCs w:val="24"/>
+              </w:rPr>
+            </w:pPr>
+            <w:r>
+              <w:rPr>
+                <w:rFonts w:ascii="Arial" w:hAnsi="Arial" w:cs="Arial"/>
+                <w:sz w:val="24"/>
+                <w:szCs w:val="24"/>
+              </w:rPr>
+              <w:t>A distribuição inicial das responsabilidades dentro da equipe será a seguinte</w:t>
+            </w:r>
+            <w:r>
+              <w:rPr>
+                <w:rFonts w:ascii="Arial" w:hAnsi="Arial" w:cs="Arial"/>
+                <w:sz w:val="24"/>
+                <w:szCs w:val="24"/>
+              </w:rPr>
+              <w:t>:</w:t>
+            </w:r>
+          </w:p>
+          <w:p>
+            <w:pPr>
+              <w:rPr>
+                <w:rFonts w:ascii="Arial" w:hAnsi="Arial" w:cs="Arial"/>
                 <w:bCs/>
                 <w:sz w:val="24"/>
                 <w:szCs w:val="24"/>
               </w:rPr>
-              <w:t>4ª Etapa – Testes, Validação e Implantação</w:t>
-            </w:r>
+            </w:pPr>
           </w:p>
           <w:p>
             <w:pPr>
@@ -2379,20 +2123,15 @@
                 <w:szCs w:val="24"/>
               </w:rPr>
             </w:pPr>
-          </w:p>
-          <w:p>
-            <w:pPr>
-              <w:numPr>
-                <w:ilvl w:val="0"/>
-                <w:numId w:val="34"/>
-              </w:numPr>
+            <w:r>
               <w:rPr>
                 <w:rFonts w:ascii="Arial" w:hAnsi="Arial" w:cs="Arial"/>
                 <w:bCs/>
                 <w:sz w:val="24"/>
                 <w:szCs w:val="24"/>
               </w:rPr>
-            </w:pPr>
+              <w:t>Gerência do Pr</w:t>
+            </w:r>
             <w:r>
               <w:rPr>
                 <w:rFonts w:ascii="Arial" w:hAnsi="Arial" w:cs="Arial"/>
@@ -2400,38 +2139,31 @@
                 <w:sz w:val="24"/>
                 <w:szCs w:val="24"/>
               </w:rPr>
-              <w:t>Testes funcionais e de usabilidade;</w:t>
-            </w:r>
-          </w:p>
-          <w:p>
-            <w:pPr>
-              <w:numPr>
-                <w:ilvl w:val="0"/>
-                <w:numId w:val="34"/>
-              </w:numPr>
+              <w:t>o</w:t>
+            </w:r>
+            <w:r>
               <w:rPr>
                 <w:rFonts w:ascii="Arial" w:hAnsi="Arial" w:cs="Arial"/>
                 <w:bCs/>
                 <w:sz w:val="24"/>
                 <w:szCs w:val="24"/>
               </w:rPr>
-            </w:pPr>
-            <w:r>
+              <w:t>jeto – Thamíris Gracielle Moreira Pereira</w:t>
+            </w:r>
+          </w:p>
+          <w:p>
+            <w:pPr>
               <w:rPr>
                 <w:rFonts w:ascii="Arial" w:hAnsi="Arial" w:cs="Arial"/>
                 <w:bCs/>
                 <w:sz w:val="24"/>
                 <w:szCs w:val="24"/>
               </w:rPr>
-              <w:t>Ajustes e melhorias;</w:t>
-            </w:r>
-          </w:p>
-          <w:p>
-            <w:pPr>
-              <w:numPr>
-                <w:ilvl w:val="0"/>
-                <w:numId w:val="34"/>
-              </w:numPr>
+            </w:pPr>
+          </w:p>
+          <w:p>
+            <w:pPr>
+              <w:spacing w:line="360" w:lineRule="auto"/>
               <w:rPr>
                 <w:rFonts w:ascii="Arial" w:hAnsi="Arial" w:cs="Arial"/>
                 <w:bCs/>
@@ -2446,248 +2178,12 @@
                 <w:sz w:val="24"/>
                 <w:szCs w:val="24"/>
               </w:rPr>
-              <w:t>Conteinerização com Docker;</w:t>
-            </w:r>
-          </w:p>
-          <w:p>
-            <w:pPr>
-              <w:numPr>
-                <w:ilvl w:val="0"/>
-                <w:numId w:val="34"/>
-              </w:numPr>
-              <w:rPr>
-                <w:rFonts w:ascii="Arial" w:hAnsi="Arial" w:cs="Arial"/>
-                <w:bCs/>
-                <w:sz w:val="24"/>
-                <w:szCs w:val="24"/>
-              </w:rPr>
-            </w:pPr>
-            <w:r>
-              <w:rPr>
-                <w:rFonts w:ascii="Arial" w:hAnsi="Arial" w:cs="Arial"/>
-                <w:bCs/>
-                <w:sz w:val="24"/>
-                <w:szCs w:val="24"/>
-              </w:rPr>
-              <w:t>Publicação da API em ambiente de nuvem;</w:t>
-            </w:r>
-          </w:p>
-          <w:p>
-            <w:pPr>
-              <w:numPr>
-                <w:ilvl w:val="0"/>
-                <w:numId w:val="34"/>
-              </w:numPr>
-              <w:rPr>
-                <w:rFonts w:ascii="Arial" w:hAnsi="Arial" w:cs="Arial"/>
-                <w:bCs/>
-                <w:sz w:val="24"/>
-                <w:szCs w:val="24"/>
-              </w:rPr>
-            </w:pPr>
-            <w:r>
-              <w:rPr>
-                <w:rFonts w:ascii="Arial" w:hAnsi="Arial" w:cs="Arial"/>
-                <w:bCs/>
-                <w:sz w:val="24"/>
-                <w:szCs w:val="24"/>
-              </w:rPr>
-              <w:t>Documentação final do projeto.</w:t>
-            </w:r>
-          </w:p>
-          <w:p>
-            <w:pPr>
-              <w:pStyle w:val="NormalWeb"/>
-              <w:rPr>
-                <w:rFonts w:ascii="Arial" w:hAnsi="Arial" w:cs="Arial"/>
-              </w:rPr>
-            </w:pPr>
-          </w:p>
-          <w:p>
-            <w:pPr>
-              <w:rPr>
-                <w:rFonts w:ascii="Arial" w:hAnsi="Arial" w:cs="Arial"/>
-                <w:b/>
-                <w:sz w:val="24"/>
-                <w:szCs w:val="24"/>
-              </w:rPr>
-            </w:pPr>
-            <w:r>
-              <w:rPr>
-                <w:rFonts w:ascii="Arial" w:hAnsi="Arial" w:cs="Arial"/>
-                <w:b/>
-                <w:sz w:val="24"/>
-                <w:szCs w:val="24"/>
-              </w:rPr>
-              <w:t>Responsabilidades</w:t>
-            </w:r>
-            <w:r>
-              <w:rPr>
-                <w:rFonts w:ascii="Arial" w:hAnsi="Arial" w:cs="Arial"/>
-                <w:b/>
-                <w:sz w:val="24"/>
-                <w:szCs w:val="24"/>
-              </w:rPr>
-              <w:t>:</w:t>
-            </w:r>
-          </w:p>
-          <w:p>
-            <w:pPr>
-              <w:rPr>
-                <w:rFonts w:ascii="Arial" w:hAnsi="Arial" w:cs="Arial"/>
-                <w:b/>
-                <w:sz w:val="24"/>
-                <w:szCs w:val="24"/>
-              </w:rPr>
-            </w:pPr>
-          </w:p>
-          <w:p>
-            <w:pPr>
-              <w:rPr>
-                <w:rFonts w:ascii="Arial" w:hAnsi="Arial" w:cs="Arial"/>
-                <w:sz w:val="24"/>
-                <w:szCs w:val="24"/>
-              </w:rPr>
-            </w:pPr>
-            <w:r>
-              <w:rPr>
-                <w:rFonts w:ascii="Arial" w:hAnsi="Arial" w:cs="Arial"/>
-                <w:sz w:val="24"/>
-                <w:szCs w:val="24"/>
-              </w:rPr>
-              <w:t>A distribuição inicial das responsabilidades dentro da equipe será a seguinte</w:t>
-            </w:r>
-            <w:r>
-              <w:rPr>
-                <w:rFonts w:ascii="Arial" w:hAnsi="Arial" w:cs="Arial"/>
-                <w:sz w:val="24"/>
-                <w:szCs w:val="24"/>
-              </w:rPr>
-              <w:t>:</w:t>
-            </w:r>
-          </w:p>
-          <w:p>
-            <w:pPr>
-              <w:rPr>
-                <w:rFonts w:ascii="Arial" w:hAnsi="Arial" w:cs="Arial"/>
-                <w:bCs/>
-                <w:sz w:val="24"/>
-                <w:szCs w:val="24"/>
-              </w:rPr>
-            </w:pPr>
-          </w:p>
-          <w:p>
-            <w:pPr>
-              <w:rPr>
-                <w:rFonts w:ascii="Arial" w:hAnsi="Arial" w:cs="Arial"/>
-                <w:bCs/>
-                <w:sz w:val="24"/>
-                <w:szCs w:val="24"/>
-              </w:rPr>
-            </w:pPr>
-            <w:r>
-              <w:rPr>
-                <w:rFonts w:ascii="Arial" w:hAnsi="Arial" w:cs="Arial"/>
-                <w:bCs/>
-                <w:sz w:val="24"/>
-                <w:szCs w:val="24"/>
-              </w:rPr>
-              <w:t xml:space="preserve">Gerência do </w:t>
-            </w:r>
-            <w:proofErr w:type="spellStart"/>
-            <w:r>
-              <w:rPr>
-                <w:rFonts w:ascii="Arial" w:hAnsi="Arial" w:cs="Arial"/>
-                <w:bCs/>
-                <w:sz w:val="24"/>
-                <w:szCs w:val="24"/>
-              </w:rPr>
-              <w:t>Prejeto</w:t>
-            </w:r>
-            <w:proofErr w:type="spellEnd"/>
-            <w:r>
-              <w:rPr>
-                <w:rFonts w:ascii="Arial" w:hAnsi="Arial" w:cs="Arial"/>
-                <w:bCs/>
-                <w:sz w:val="24"/>
-                <w:szCs w:val="24"/>
-              </w:rPr>
-              <w:t xml:space="preserve"> </w:t>
-            </w:r>
-            <w:proofErr w:type="gramStart"/>
-            <w:r>
-              <w:rPr>
-                <w:rFonts w:ascii="Arial" w:hAnsi="Arial" w:cs="Arial"/>
-                <w:bCs/>
-                <w:sz w:val="24"/>
-                <w:szCs w:val="24"/>
-              </w:rPr>
-              <w:t xml:space="preserve">–  </w:t>
-            </w:r>
-            <w:proofErr w:type="spellStart"/>
-            <w:r>
-              <w:rPr>
-                <w:rFonts w:ascii="Arial" w:hAnsi="Arial" w:cs="Arial"/>
-                <w:bCs/>
-                <w:sz w:val="24"/>
-                <w:szCs w:val="24"/>
-              </w:rPr>
-              <w:t>Thamíris</w:t>
-            </w:r>
-            <w:proofErr w:type="spellEnd"/>
-            <w:proofErr w:type="gramEnd"/>
-            <w:r>
-              <w:rPr>
-                <w:rFonts w:ascii="Arial" w:hAnsi="Arial" w:cs="Arial"/>
-                <w:bCs/>
-                <w:sz w:val="24"/>
-                <w:szCs w:val="24"/>
-              </w:rPr>
-              <w:t xml:space="preserve"> </w:t>
-            </w:r>
-            <w:proofErr w:type="spellStart"/>
-            <w:r>
-              <w:rPr>
-                <w:rFonts w:ascii="Arial" w:hAnsi="Arial" w:cs="Arial"/>
-                <w:bCs/>
-                <w:sz w:val="24"/>
-                <w:szCs w:val="24"/>
-              </w:rPr>
-              <w:t>Gracielle</w:t>
-            </w:r>
-            <w:proofErr w:type="spellEnd"/>
-            <w:r>
-              <w:rPr>
-                <w:rFonts w:ascii="Arial" w:hAnsi="Arial" w:cs="Arial"/>
-                <w:bCs/>
-                <w:sz w:val="24"/>
-                <w:szCs w:val="24"/>
-              </w:rPr>
-              <w:t xml:space="preserve"> Moreira Pereira</w:t>
-            </w:r>
-          </w:p>
-          <w:p>
-            <w:pPr>
-              <w:rPr>
-                <w:rFonts w:ascii="Arial" w:hAnsi="Arial" w:cs="Arial"/>
-                <w:bCs/>
-                <w:sz w:val="24"/>
-                <w:szCs w:val="24"/>
-              </w:rPr>
-            </w:pPr>
-          </w:p>
-          <w:p>
-            <w:pPr>
-              <w:rPr>
-                <w:rFonts w:ascii="Arial" w:hAnsi="Arial" w:cs="Arial"/>
-                <w:bCs/>
-                <w:sz w:val="24"/>
-                <w:szCs w:val="24"/>
-              </w:rPr>
-            </w:pPr>
-          </w:p>
-          <w:p>
-            <w:pPr>
+              <w:t>As demais atividades relacionadas ao desenvolvimento do projeto serão realizadas de forma colaborativa entre os integrantes da equipe. A divisão das tarefas poderá ser ajustada ao longo da execução do trabalho, conforme as necessidades identificadas e a evolução das etapas previstas.</w:t>
+            </w:r>
+          </w:p>
+          <w:p>
+            <w:pPr>
+              <w:spacing w:line="360" w:lineRule="auto"/>
               <w:rPr>
                 <w:rFonts w:ascii="Arial" w:hAnsi="Arial" w:cs="Arial"/>
                 <w:bCs/>
@@ -2845,25 +2341,7 @@
                 <w:sz w:val="24"/>
                 <w:szCs w:val="24"/>
               </w:rPr>
-              <w:t xml:space="preserve">Google </w:t>
-            </w:r>
-            <w:proofErr w:type="spellStart"/>
-            <w:r>
-              <w:rPr>
-                <w:rFonts w:ascii="Arial" w:hAnsi="Arial" w:cs="Arial"/>
-                <w:sz w:val="24"/>
-                <w:szCs w:val="24"/>
-              </w:rPr>
-              <w:t>Forms</w:t>
-            </w:r>
-            <w:proofErr w:type="spellEnd"/>
-            <w:r>
-              <w:rPr>
-                <w:rFonts w:ascii="Arial" w:hAnsi="Arial" w:cs="Arial"/>
-                <w:sz w:val="24"/>
-                <w:szCs w:val="24"/>
-              </w:rPr>
-              <w:t xml:space="preserve"> para aplicação de questionários;</w:t>
+              <w:t>Google Forms para aplicação de questionários;</w:t>
             </w:r>
           </w:p>
           <w:p>
@@ -2885,43 +2363,8 @@
                 <w:sz w:val="24"/>
                 <w:szCs w:val="24"/>
               </w:rPr>
-              <w:t xml:space="preserve">Ferramenta Case </w:t>
-            </w:r>
-            <w:proofErr w:type="spellStart"/>
-            <w:r>
-              <w:rPr>
-                <w:rFonts w:ascii="Arial" w:hAnsi="Arial" w:cs="Arial"/>
-                <w:sz w:val="24"/>
-                <w:szCs w:val="24"/>
-              </w:rPr>
-              <w:t>Ideas</w:t>
-            </w:r>
-            <w:proofErr w:type="spellEnd"/>
-            <w:r>
-              <w:rPr>
-                <w:rFonts w:ascii="Arial" w:hAnsi="Arial" w:cs="Arial"/>
-                <w:sz w:val="24"/>
-                <w:szCs w:val="24"/>
-              </w:rPr>
-              <w:t xml:space="preserve"> </w:t>
-            </w:r>
-            <w:proofErr w:type="spellStart"/>
-            <w:r>
-              <w:rPr>
-                <w:rFonts w:ascii="Arial" w:hAnsi="Arial" w:cs="Arial"/>
-                <w:sz w:val="24"/>
-                <w:szCs w:val="24"/>
-              </w:rPr>
-              <w:t>Modeler</w:t>
-            </w:r>
-            <w:proofErr w:type="spellEnd"/>
-            <w:r>
-              <w:rPr>
-                <w:rFonts w:ascii="Arial" w:hAnsi="Arial" w:cs="Arial"/>
-                <w:sz w:val="24"/>
-                <w:szCs w:val="24"/>
-              </w:rPr>
-              <w:t>;</w:t>
+              <w:lastRenderedPageBreak/>
+              <w:t>Ferramenta Case Ideas Modeler;</w:t>
             </w:r>
           </w:p>
           <w:p>
@@ -2937,23 +2380,13 @@
                 <w:szCs w:val="24"/>
               </w:rPr>
             </w:pPr>
-            <w:proofErr w:type="spellStart"/>
-            <w:r>
-              <w:rPr>
-                <w:rFonts w:ascii="Arial" w:hAnsi="Arial" w:cs="Arial"/>
-                <w:sz w:val="24"/>
-                <w:szCs w:val="24"/>
-              </w:rPr>
-              <w:t>Figma</w:t>
-            </w:r>
-            <w:proofErr w:type="spellEnd"/>
-            <w:r>
-              <w:rPr>
-                <w:rFonts w:ascii="Arial" w:hAnsi="Arial" w:cs="Arial"/>
-                <w:sz w:val="24"/>
-                <w:szCs w:val="24"/>
-              </w:rPr>
-              <w:t xml:space="preserve"> para prototipação das interfaces;</w:t>
+            <w:r>
+              <w:rPr>
+                <w:rFonts w:ascii="Arial" w:hAnsi="Arial" w:cs="Arial"/>
+                <w:sz w:val="24"/>
+                <w:szCs w:val="24"/>
+              </w:rPr>
+              <w:t>Figma para prototipação das interfaces;</w:t>
             </w:r>
           </w:p>
           <w:p>
@@ -2969,41 +2402,13 @@
                 <w:szCs w:val="24"/>
               </w:rPr>
             </w:pPr>
-            <w:proofErr w:type="spellStart"/>
-            <w:r>
-              <w:rPr>
-                <w:rFonts w:ascii="Arial" w:hAnsi="Arial" w:cs="Arial"/>
-                <w:sz w:val="24"/>
-                <w:szCs w:val="24"/>
-              </w:rPr>
-              <w:t>IntelliJ</w:t>
-            </w:r>
-            <w:proofErr w:type="spellEnd"/>
-            <w:r>
-              <w:rPr>
-                <w:rFonts w:ascii="Arial" w:hAnsi="Arial" w:cs="Arial"/>
-                <w:sz w:val="24"/>
-                <w:szCs w:val="24"/>
-              </w:rPr>
-              <w:t xml:space="preserve"> IDEA para desenvolvimento </w:t>
-            </w:r>
-            <w:proofErr w:type="spellStart"/>
-            <w:r>
-              <w:rPr>
-                <w:rFonts w:ascii="Arial" w:hAnsi="Arial" w:cs="Arial"/>
-                <w:sz w:val="24"/>
-                <w:szCs w:val="24"/>
-              </w:rPr>
-              <w:t>backend</w:t>
-            </w:r>
-            <w:proofErr w:type="spellEnd"/>
-            <w:r>
-              <w:rPr>
-                <w:rFonts w:ascii="Arial" w:hAnsi="Arial" w:cs="Arial"/>
-                <w:sz w:val="24"/>
-                <w:szCs w:val="24"/>
-              </w:rPr>
-              <w:t>;</w:t>
+            <w:r>
+              <w:rPr>
+                <w:rFonts w:ascii="Arial" w:hAnsi="Arial" w:cs="Arial"/>
+                <w:sz w:val="24"/>
+                <w:szCs w:val="24"/>
+              </w:rPr>
+              <w:t>IntelliJ IDEA para desenvolvimento backend;</w:t>
             </w:r>
           </w:p>
           <w:p>
@@ -3025,43 +2430,7 @@
                 <w:sz w:val="24"/>
                 <w:szCs w:val="24"/>
               </w:rPr>
-              <w:t xml:space="preserve">Android Studio ou Visual Studio </w:t>
-            </w:r>
-            <w:proofErr w:type="spellStart"/>
-            <w:r>
-              <w:rPr>
-                <w:rFonts w:ascii="Arial" w:hAnsi="Arial" w:cs="Arial"/>
-                <w:sz w:val="24"/>
-                <w:szCs w:val="24"/>
-              </w:rPr>
-              <w:t>Code</w:t>
-            </w:r>
-            <w:proofErr w:type="spellEnd"/>
-            <w:r>
-              <w:rPr>
-                <w:rFonts w:ascii="Arial" w:hAnsi="Arial" w:cs="Arial"/>
-                <w:sz w:val="24"/>
-                <w:szCs w:val="24"/>
-              </w:rPr>
-              <w:t xml:space="preserve"> para desenvolvimento mobile em </w:t>
-            </w:r>
-            <w:proofErr w:type="spellStart"/>
-            <w:r>
-              <w:rPr>
-                <w:rFonts w:ascii="Arial" w:hAnsi="Arial" w:cs="Arial"/>
-                <w:sz w:val="24"/>
-                <w:szCs w:val="24"/>
-              </w:rPr>
-              <w:t>Flutter</w:t>
-            </w:r>
-            <w:proofErr w:type="spellEnd"/>
-            <w:r>
-              <w:rPr>
-                <w:rFonts w:ascii="Arial" w:hAnsi="Arial" w:cs="Arial"/>
-                <w:sz w:val="24"/>
-                <w:szCs w:val="24"/>
-              </w:rPr>
-              <w:t>;</w:t>
+              <w:t>Android Studio ou Visual Studio Code para desenvolvimento mobile;</w:t>
             </w:r>
           </w:p>
           <w:p>
@@ -3099,23 +2468,13 @@
                 <w:szCs w:val="24"/>
               </w:rPr>
             </w:pPr>
-            <w:proofErr w:type="spellStart"/>
-            <w:r>
-              <w:rPr>
-                <w:rFonts w:ascii="Arial" w:hAnsi="Arial" w:cs="Arial"/>
-                <w:sz w:val="24"/>
-                <w:szCs w:val="24"/>
-              </w:rPr>
-              <w:t>Flutter</w:t>
-            </w:r>
-            <w:proofErr w:type="spellEnd"/>
-            <w:r>
-              <w:rPr>
-                <w:rFonts w:ascii="Arial" w:hAnsi="Arial" w:cs="Arial"/>
-                <w:sz w:val="24"/>
-                <w:szCs w:val="24"/>
-              </w:rPr>
-              <w:t xml:space="preserve"> (Dart);</w:t>
+            <w:r>
+              <w:rPr>
+                <w:rFonts w:ascii="Arial" w:hAnsi="Arial" w:cs="Arial"/>
+                <w:sz w:val="24"/>
+                <w:szCs w:val="24"/>
+              </w:rPr>
+              <w:t>Flutter (Dart);</w:t>
             </w:r>
           </w:p>
           <w:p>
@@ -3137,25 +2496,7 @@
                 <w:sz w:val="24"/>
                 <w:szCs w:val="24"/>
               </w:rPr>
-              <w:t xml:space="preserve">PostgreSQL com extensão </w:t>
-            </w:r>
-            <w:proofErr w:type="spellStart"/>
-            <w:r>
-              <w:rPr>
-                <w:rFonts w:ascii="Arial" w:hAnsi="Arial" w:cs="Arial"/>
-                <w:sz w:val="24"/>
-                <w:szCs w:val="24"/>
-              </w:rPr>
-              <w:t>PostGIS</w:t>
-            </w:r>
-            <w:proofErr w:type="spellEnd"/>
-            <w:r>
-              <w:rPr>
-                <w:rFonts w:ascii="Arial" w:hAnsi="Arial" w:cs="Arial"/>
-                <w:sz w:val="24"/>
-                <w:szCs w:val="24"/>
-              </w:rPr>
-              <w:t>;</w:t>
+              <w:t>PostgreSQL com extensão PostGIS;</w:t>
             </w:r>
           </w:p>
           <w:p>
@@ -3171,23 +2512,13 @@
                 <w:szCs w:val="24"/>
               </w:rPr>
             </w:pPr>
-            <w:proofErr w:type="spellStart"/>
-            <w:r>
-              <w:rPr>
-                <w:rFonts w:ascii="Arial" w:hAnsi="Arial" w:cs="Arial"/>
-                <w:sz w:val="24"/>
-                <w:szCs w:val="24"/>
-              </w:rPr>
-              <w:t>RabbitMQ</w:t>
-            </w:r>
-            <w:proofErr w:type="spellEnd"/>
-            <w:r>
-              <w:rPr>
-                <w:rFonts w:ascii="Arial" w:hAnsi="Arial" w:cs="Arial"/>
-                <w:sz w:val="24"/>
-                <w:szCs w:val="24"/>
-              </w:rPr>
-              <w:t xml:space="preserve"> (mensageria);</w:t>
+            <w:r>
+              <w:rPr>
+                <w:rFonts w:ascii="Arial" w:hAnsi="Arial" w:cs="Arial"/>
+                <w:sz w:val="24"/>
+                <w:szCs w:val="24"/>
+              </w:rPr>
+              <w:t>RabbitMQ (mensageria);</w:t>
             </w:r>
           </w:p>
           <w:p>
@@ -3225,23 +2556,13 @@
                 <w:szCs w:val="24"/>
               </w:rPr>
             </w:pPr>
-            <w:proofErr w:type="spellStart"/>
-            <w:r>
-              <w:rPr>
-                <w:rFonts w:ascii="Arial" w:hAnsi="Arial" w:cs="Arial"/>
-                <w:sz w:val="24"/>
-                <w:szCs w:val="24"/>
-              </w:rPr>
-              <w:t>Git</w:t>
-            </w:r>
-            <w:proofErr w:type="spellEnd"/>
-            <w:r>
-              <w:rPr>
-                <w:rFonts w:ascii="Arial" w:hAnsi="Arial" w:cs="Arial"/>
-                <w:sz w:val="24"/>
-                <w:szCs w:val="24"/>
-              </w:rPr>
-              <w:t xml:space="preserve"> e GitHub para controle de versão;</w:t>
+            <w:r>
+              <w:rPr>
+                <w:rFonts w:ascii="Arial" w:hAnsi="Arial" w:cs="Arial"/>
+                <w:sz w:val="24"/>
+                <w:szCs w:val="24"/>
+              </w:rPr>
+              <w:t>Git e GitHub para controle de versão;</w:t>
             </w:r>
           </w:p>
           <w:p>
@@ -3285,29 +2606,15 @@
                 <w:sz w:val="24"/>
                 <w:szCs w:val="24"/>
               </w:rPr>
-              <w:t>Smartphone Android para testes;</w:t>
-            </w:r>
-          </w:p>
-          <w:p>
-            <w:pPr>
-              <w:numPr>
-                <w:ilvl w:val="0"/>
-                <w:numId w:val="35"/>
-              </w:numPr>
-              <w:spacing w:before="100" w:beforeAutospacing="1" w:after="100" w:afterAutospacing="1"/>
-              <w:rPr>
-                <w:rFonts w:ascii="Arial" w:hAnsi="Arial" w:cs="Arial"/>
-                <w:sz w:val="24"/>
-                <w:szCs w:val="24"/>
-              </w:rPr>
-            </w:pPr>
-            <w:r>
-              <w:rPr>
-                <w:rFonts w:ascii="Arial" w:hAnsi="Arial" w:cs="Arial"/>
-                <w:sz w:val="24"/>
-                <w:szCs w:val="24"/>
-              </w:rPr>
-              <w:t>Plataforma de hospedagem em nuvem para publicação da API.</w:t>
+              <w:t>Smartphone Android para testes</w:t>
+            </w:r>
+            <w:r>
+              <w:rPr>
+                <w:rFonts w:ascii="Arial" w:hAnsi="Arial" w:cs="Arial"/>
+                <w:sz w:val="24"/>
+                <w:szCs w:val="24"/>
+              </w:rPr>
+              <w:t>.</w:t>
             </w:r>
           </w:p>
         </w:tc>
@@ -3765,25 +3072,7 @@
                 <w:sz w:val="24"/>
                 <w:szCs w:val="24"/>
               </w:rPr>
-              <w:t>da FAI (</w:t>
-            </w:r>
-            <w:proofErr w:type="spellStart"/>
-            <w:r>
-              <w:rPr>
-                <w:rFonts w:ascii="Arial" w:hAnsi="Arial" w:cs="Arial"/>
-                <w:sz w:val="24"/>
-                <w:szCs w:val="24"/>
-              </w:rPr>
-              <w:t>Faitec</w:t>
-            </w:r>
-            <w:proofErr w:type="spellEnd"/>
-            <w:r>
-              <w:rPr>
-                <w:rFonts w:ascii="Arial" w:hAnsi="Arial" w:cs="Arial"/>
-                <w:sz w:val="24"/>
-                <w:szCs w:val="24"/>
-              </w:rPr>
-              <w:t>)</w:t>
+              <w:t>da FAI (Faitec)</w:t>
             </w:r>
           </w:p>
         </w:tc>

</xml_diff>